<commit_message>
feat: publish AI-reviewed demo content v2 and corrected DL labels
#7 按项目负责人决定由 AI 逐条复核代替人工校对，如实记录为“AI 起草、AI 复核”：
- data/demo/v2：在 v1 之上发布。9 道语境题只留一个正确答案（互换或改写例句，出题时排除
  significant/crucial/fundamental、diminish/undermine 近义干扰词）；diminish 释义改为“减弱；变小”，
  避免拼写题与 decline 混淆；修正 2 条例句与译文。17 道题目版本加一、旧版本停用，13 条例句换用 demo-v2
- build_demo.py 与 v1 比对生成版本；测试检查 v2 只在 v1 之上新增版本、近义干扰词已排除；
  db 测试与演示库都按 v1→v2 顺序导入
- DL 标注改为 ai_reviewed：移出 d01/t05/t11/t26 各 1 条不相关例句，为 t25 补充 1 条；
  evaluate-example-search 如实报告标注状态
- 重建索引并重跑评价与耗时；exp04 证据、实验四报告、开发规范、验收与 README 同步；
  M05 的独立标注作为局限写入

验收：T10、T12、M05

Co-Authored-By: Claude Opus 5.5 <noreply@anthropic.com>
</commit_message>
<xml_diff>
--- a/docs/reports/实验四_案例数据分析（深度学习）.docx
+++ b/docs/reports/实验四_案例数据分析（深度学习）.docx
@@ -4811,7 +4811,7 @@
                 <w:sz w:val="24"/>
                 <w:szCs w:val="24"/>
               </w:rPr>
-              <w:t xml:space="preserve">评价查询：dev 10 条、test 30 条英语查询，分为近义改写、多义词的特定词义和语料中没有相关例句三类，同语料上与 TF-IDF 对照。标注状态：AI 草拟、待人工确认（#7），不是独立人工标注。</w:t>
+              <w:t xml:space="preserve">评价查询：dev 10 条、test 30 条英语查询，分为近义改写、多义词的特定词义和语料中没有相关例句三类，同语料上与 TF-IDF 对照。标注状态：AI 起草并经 AI 复核，不是独立人工标注。</w:t>
             </w:r>
           </w:p>
           <w:tbl>
@@ -5180,7 +5180,7 @@
                       <w:sz w:val="18"/>
                       <w:szCs w:val="18"/>
                     </w:rPr>
-                    <w:t xml:space="preserve">0.3125</w:t>
+                    <w:t xml:space="preserve">0.375</w:t>
                   </w:r>
                 </w:p>
               </w:tc>
@@ -5302,7 +5302,7 @@
                       <w:sz w:val="18"/>
                       <w:szCs w:val="18"/>
                     </w:rPr>
-                    <w:t xml:space="preserve">0.6296</w:t>
+                    <w:t xml:space="preserve">0.6914</w:t>
                   </w:r>
                 </w:p>
               </w:tc>
@@ -5326,7 +5326,7 @@
                       <w:sz w:val="18"/>
                       <w:szCs w:val="18"/>
                     </w:rPr>
-                    <w:t xml:space="preserve">0.9074</w:t>
+                    <w:t xml:space="preserve">0.9259</w:t>
                   </w:r>
                 </w:p>
               </w:tc>
@@ -5424,7 +5424,7 @@
                       <w:sz w:val="18"/>
                       <w:szCs w:val="18"/>
                     </w:rPr>
-                    <w:t xml:space="preserve">0.3148</w:t>
+                    <w:t xml:space="preserve">0.3457</w:t>
                   </w:r>
                 </w:p>
               </w:tc>
@@ -5448,7 +5448,7 @@
                       <w:sz w:val="18"/>
                       <w:szCs w:val="18"/>
                     </w:rPr>
-                    <w:t xml:space="preserve">0.5617</w:t>
+                    <w:t xml:space="preserve">0.5741</w:t>
                   </w:r>
                 </w:p>
               </w:tc>
@@ -5711,7 +5711,7 @@
                       <w:sz w:val="18"/>
                       <w:szCs w:val="18"/>
                     </w:rPr>
-                    <w:t xml:space="preserve">0.6389</w:t>
+                    <w:t xml:space="preserve">0.6667</w:t>
                   </w:r>
                 </w:p>
               </w:tc>
@@ -5833,7 +5833,7 @@
                       <w:sz w:val="18"/>
                       <w:szCs w:val="18"/>
                     </w:rPr>
-                    <w:t xml:space="preserve">0.6111</w:t>
+                    <w:t xml:space="preserve">0.7407</w:t>
                   </w:r>
                 </w:p>
               </w:tc>
@@ -5857,7 +5857,7 @@
                       <w:sz w:val="18"/>
                       <w:szCs w:val="18"/>
                     </w:rPr>
-                    <w:t xml:space="preserve">0.8889</w:t>
+                    <w:t xml:space="preserve">0.9444</w:t>
                   </w:r>
                 </w:p>
               </w:tc>
@@ -5955,7 +5955,7 @@
                       <w:sz w:val="18"/>
                       <w:szCs w:val="18"/>
                     </w:rPr>
-                    <w:t xml:space="preserve">0.3889</w:t>
+                    <w:t xml:space="preserve">0.4167</w:t>
                   </w:r>
                 </w:p>
               </w:tc>
@@ -6077,7 +6077,7 @@
                       <w:sz w:val="18"/>
                       <w:szCs w:val="18"/>
                     </w:rPr>
-                    <w:t xml:space="preserve">0.1667</w:t>
+                    <w:t xml:space="preserve">0.2037</w:t>
                   </w:r>
                 </w:p>
               </w:tc>
@@ -6101,7 +6101,7 @@
                       <w:sz w:val="18"/>
                       <w:szCs w:val="18"/>
                     </w:rPr>
-                    <w:t xml:space="preserve">0.2593</w:t>
+                    <w:t xml:space="preserve">0.2963</w:t>
                   </w:r>
                 </w:p>
               </w:tc>
@@ -6314,7 +6314,7 @@
                       <w:sz w:val="18"/>
                       <w:szCs w:val="18"/>
                     </w:rPr>
-                    <w:t xml:space="preserve">7403.935</w:t>
+                    <w:t xml:space="preserve">7174.383</w:t>
                   </w:r>
                 </w:p>
               </w:tc>
@@ -6338,7 +6338,7 @@
                       <w:sz w:val="18"/>
                       <w:szCs w:val="18"/>
                     </w:rPr>
-                    <w:t xml:space="preserve">7376.828</w:t>
+                    <w:t xml:space="preserve">7146.548</w:t>
                   </w:r>
                 </w:p>
               </w:tc>
@@ -6362,7 +6362,7 @@
                       <w:sz w:val="18"/>
                       <w:szCs w:val="18"/>
                     </w:rPr>
-                    <w:t xml:space="preserve">263.075</w:t>
+                    <w:t xml:space="preserve">240.908</w:t>
                   </w:r>
                 </w:p>
               </w:tc>
@@ -6412,7 +6412,7 @@
                       <w:sz w:val="18"/>
                       <w:szCs w:val="18"/>
                     </w:rPr>
-                    <w:t xml:space="preserve">51.172</w:t>
+                    <w:t xml:space="preserve">49.174</w:t>
                   </w:r>
                 </w:p>
               </w:tc>
@@ -6436,7 +6436,7 @@
                       <w:sz w:val="18"/>
                       <w:szCs w:val="18"/>
                     </w:rPr>
-                    <w:t xml:space="preserve">25.497</w:t>
+                    <w:t xml:space="preserve">24.605</w:t>
                   </w:r>
                 </w:p>
               </w:tc>
@@ -6460,7 +6460,7 @@
                       <w:sz w:val="18"/>
                       <w:szCs w:val="18"/>
                     </w:rPr>
-                    <w:t xml:space="preserve">21.463</w:t>
+                    <w:t xml:space="preserve">20.745</w:t>
                   </w:r>
                 </w:p>
               </w:tc>
@@ -6510,7 +6510,7 @@
                       <w:sz w:val="18"/>
                       <w:szCs w:val="18"/>
                     </w:rPr>
-                    <w:t xml:space="preserve">55.123</w:t>
+                    <w:t xml:space="preserve">53.676</w:t>
                   </w:r>
                 </w:p>
               </w:tc>
@@ -6534,7 +6534,7 @@
                       <w:sz w:val="18"/>
                       <w:szCs w:val="18"/>
                     </w:rPr>
-                    <w:t xml:space="preserve">29.982</w:t>
+                    <w:t xml:space="preserve">27.312</w:t>
                   </w:r>
                 </w:p>
               </w:tc>
@@ -6558,7 +6558,7 @@
                       <w:sz w:val="18"/>
                       <w:szCs w:val="18"/>
                     </w:rPr>
-                    <w:t xml:space="preserve">26.111</w:t>
+                    <w:t xml:space="preserve">23.363</w:t>
                   </w:r>
                 </w:p>
               </w:tc>
@@ -6960,7 +6960,7 @@
                 <w:sz w:val="24"/>
                 <w:szCs w:val="24"/>
               </w:rPr>
-              <w:t xml:space="preserve">（2）错误分析：t18“Lower prices encourage people to buy more.”前三名为 decline-1-1、reluctant-1-2、significant-1-2。查询描述的是“激励”这个概念，而“涨价后销量下降”“顾客不愿为环保产品多付钱”等例句与查询同属价格与购买话题，模型更多捕捉到了话题相似，而不是 incentive 这个词义本身。</w:t>
+              <w:t xml:space="preserve">（2）错误分析：t18“Lower prices encourage people to buy more.”前三名为 decline-1-1、reluctant-1-2、significant-1-1。查询描述的是“激励”这个概念，而“涨价后销量下降”“顾客不愿为环保产品多付钱”等例句与查询同属价格与购买话题，模型更多捕捉到了话题相似，而不是 incentive 这个词义本身。</w:t>
             </w:r>
           </w:p>
           <w:p>
@@ -7008,7 +7008,7 @@
                 <w:sz w:val="24"/>
                 <w:szCs w:val="24"/>
               </w:rPr>
-              <w:t xml:space="preserve">（4）评价的局限：语料与查询都是项目自编的小规模演示内容，查询与相关性标注目前由 AI 起草、尚待人工逐条确认，因此上述指标只反映这份演示语料，确认后需要重新运行评价。</w:t>
+              <w:t xml:space="preserve">（4）评价的局限：语料与查询都是项目自编的小规模演示内容；查询与相关性标注由 AI 起草，并经 AI 逐条复核修正（移出 4 条明显不相关的标注、补充 1 条），不是独立人工标注。复核时已看过前一次评价结果，虽然检索方法与参数未作调整、两种方法使用同一标注，对照仍然公平，但绝对数值可能偏高，只反映这份演示语料。</w:t>
             </w:r>
           </w:p>
           <w:p>
@@ -7055,7 +7055,7 @@
                 <w:sz w:val="24"/>
                 <w:szCs w:val="24"/>
               </w:rPr>
-              <w:t xml:space="preserve">本实验完成了预训练深度学习模型的本地部署与集成：固定模型版本并校验文件、离线构建向量索引、Flask 在线检索、MySQL 留证，并用独立查询集与 TF-IDF 对照评价。句向量检索在 test 集上的 MRR@3 为 0.9074，TF-IDF 为 0.5617。</w:t>
+              <w:t xml:space="preserve">本实验完成了预训练深度学习模型的本地部署与集成：固定模型版本并校验文件、离线构建向量索引、Flask 在线检索、MySQL 留证，并用独立查询集与 TF-IDF 对照评价。句向量检索在 test 集上的 MRR@3 为 0.9259，TF-IDF 为 0.5741。</w:t>
             </w:r>
           </w:p>
           <w:p>
@@ -7079,7 +7079,7 @@
                 <w:sz w:val="24"/>
                 <w:szCs w:val="24"/>
               </w:rPr>
-              <w:t xml:space="preserve">思考：深度学习模型的首次加载开销远大于单次推理（本实验首次请求约 7 秒，预热后约 20 毫秒），应在进程内只加载一次；模型、向量与语料三者的版本必须绑定，任何一方变化都要能被发现并拒绝旧结果。此外，评价数据必须独立于语料、并由人工确认，否则指标很容易高估真实效果。</w:t>
+              <w:t xml:space="preserve">思考：深度学习模型的首次加载开销远大于单次推理（本实验首次请求约 7 秒，预热后约 20 毫秒），应在进程内只加载一次；模型、向量与语料三者的版本必须绑定，任何一方变化都要能被发现并拒绝旧结果。此外，评价数据应独立于语料并由人工确认；本实验的标注只经 AI 复核，这是评价部分最主要的不足。</w:t>
             </w:r>
           </w:p>
           <w:p>

</xml_diff>

<commit_message>
feat: publish AI-reviewed demo content v2 and corrected DL labels (#25)
#7 按项目负责人决定由 AI 逐条复核代替人工校对，如实记录为“AI 起草、AI 复核”：
- data/demo/v2 在 v1 之上发布：9 道语境题只留一个正确答案，排除近义干扰词；diminish 释义避免
  拼写题误判；17 道题目版本加一、旧版本停用，13 条例句换用 demo-v2
- DL 标注 ai_reviewed：移出 4 条、补充 1 条相关例句；评价命令如实报告标注状态
- 重建索引、评价与耗时；实验四报告、文档、验收与幻灯片同步；M05 独立标注列为局限

证据中的 commit 号（6614494）为 squash 前的分支提交，代码与本次合并相同。

验收：T10、T12、M05

Co-Authored-By: Claude Opus 5.5 <noreply@anthropic.com>
</commit_message>
<xml_diff>
--- a/docs/reports/实验四_案例数据分析（深度学习）.docx
+++ b/docs/reports/实验四_案例数据分析（深度学习）.docx
@@ -4811,7 +4811,7 @@
                 <w:sz w:val="24"/>
                 <w:szCs w:val="24"/>
               </w:rPr>
-              <w:t xml:space="preserve">评价查询：dev 10 条、test 30 条英语查询，分为近义改写、多义词的特定词义和语料中没有相关例句三类，同语料上与 TF-IDF 对照。标注状态：AI 草拟、待人工确认（#7），不是独立人工标注。</w:t>
+              <w:t xml:space="preserve">评价查询：dev 10 条、test 30 条英语查询，分为近义改写、多义词的特定词义和语料中没有相关例句三类，同语料上与 TF-IDF 对照。标注状态：AI 起草并经 AI 复核，不是独立人工标注。</w:t>
             </w:r>
           </w:p>
           <w:tbl>
@@ -5180,7 +5180,7 @@
                       <w:sz w:val="18"/>
                       <w:szCs w:val="18"/>
                     </w:rPr>
-                    <w:t xml:space="preserve">0.3125</w:t>
+                    <w:t xml:space="preserve">0.375</w:t>
                   </w:r>
                 </w:p>
               </w:tc>
@@ -5302,7 +5302,7 @@
                       <w:sz w:val="18"/>
                       <w:szCs w:val="18"/>
                     </w:rPr>
-                    <w:t xml:space="preserve">0.6296</w:t>
+                    <w:t xml:space="preserve">0.6914</w:t>
                   </w:r>
                 </w:p>
               </w:tc>
@@ -5326,7 +5326,7 @@
                       <w:sz w:val="18"/>
                       <w:szCs w:val="18"/>
                     </w:rPr>
-                    <w:t xml:space="preserve">0.9074</w:t>
+                    <w:t xml:space="preserve">0.9259</w:t>
                   </w:r>
                 </w:p>
               </w:tc>
@@ -5424,7 +5424,7 @@
                       <w:sz w:val="18"/>
                       <w:szCs w:val="18"/>
                     </w:rPr>
-                    <w:t xml:space="preserve">0.3148</w:t>
+                    <w:t xml:space="preserve">0.3457</w:t>
                   </w:r>
                 </w:p>
               </w:tc>
@@ -5448,7 +5448,7 @@
                       <w:sz w:val="18"/>
                       <w:szCs w:val="18"/>
                     </w:rPr>
-                    <w:t xml:space="preserve">0.5617</w:t>
+                    <w:t xml:space="preserve">0.5741</w:t>
                   </w:r>
                 </w:p>
               </w:tc>
@@ -5711,7 +5711,7 @@
                       <w:sz w:val="18"/>
                       <w:szCs w:val="18"/>
                     </w:rPr>
-                    <w:t xml:space="preserve">0.6389</w:t>
+                    <w:t xml:space="preserve">0.6667</w:t>
                   </w:r>
                 </w:p>
               </w:tc>
@@ -5833,7 +5833,7 @@
                       <w:sz w:val="18"/>
                       <w:szCs w:val="18"/>
                     </w:rPr>
-                    <w:t xml:space="preserve">0.6111</w:t>
+                    <w:t xml:space="preserve">0.7407</w:t>
                   </w:r>
                 </w:p>
               </w:tc>
@@ -5857,7 +5857,7 @@
                       <w:sz w:val="18"/>
                       <w:szCs w:val="18"/>
                     </w:rPr>
-                    <w:t xml:space="preserve">0.8889</w:t>
+                    <w:t xml:space="preserve">0.9444</w:t>
                   </w:r>
                 </w:p>
               </w:tc>
@@ -5955,7 +5955,7 @@
                       <w:sz w:val="18"/>
                       <w:szCs w:val="18"/>
                     </w:rPr>
-                    <w:t xml:space="preserve">0.3889</w:t>
+                    <w:t xml:space="preserve">0.4167</w:t>
                   </w:r>
                 </w:p>
               </w:tc>
@@ -6077,7 +6077,7 @@
                       <w:sz w:val="18"/>
                       <w:szCs w:val="18"/>
                     </w:rPr>
-                    <w:t xml:space="preserve">0.1667</w:t>
+                    <w:t xml:space="preserve">0.2037</w:t>
                   </w:r>
                 </w:p>
               </w:tc>
@@ -6101,7 +6101,7 @@
                       <w:sz w:val="18"/>
                       <w:szCs w:val="18"/>
                     </w:rPr>
-                    <w:t xml:space="preserve">0.2593</w:t>
+                    <w:t xml:space="preserve">0.2963</w:t>
                   </w:r>
                 </w:p>
               </w:tc>
@@ -6314,7 +6314,7 @@
                       <w:sz w:val="18"/>
                       <w:szCs w:val="18"/>
                     </w:rPr>
-                    <w:t xml:space="preserve">7403.935</w:t>
+                    <w:t xml:space="preserve">7174.383</w:t>
                   </w:r>
                 </w:p>
               </w:tc>
@@ -6338,7 +6338,7 @@
                       <w:sz w:val="18"/>
                       <w:szCs w:val="18"/>
                     </w:rPr>
-                    <w:t xml:space="preserve">7376.828</w:t>
+                    <w:t xml:space="preserve">7146.548</w:t>
                   </w:r>
                 </w:p>
               </w:tc>
@@ -6362,7 +6362,7 @@
                       <w:sz w:val="18"/>
                       <w:szCs w:val="18"/>
                     </w:rPr>
-                    <w:t xml:space="preserve">263.075</w:t>
+                    <w:t xml:space="preserve">240.908</w:t>
                   </w:r>
                 </w:p>
               </w:tc>
@@ -6412,7 +6412,7 @@
                       <w:sz w:val="18"/>
                       <w:szCs w:val="18"/>
                     </w:rPr>
-                    <w:t xml:space="preserve">51.172</w:t>
+                    <w:t xml:space="preserve">49.174</w:t>
                   </w:r>
                 </w:p>
               </w:tc>
@@ -6436,7 +6436,7 @@
                       <w:sz w:val="18"/>
                       <w:szCs w:val="18"/>
                     </w:rPr>
-                    <w:t xml:space="preserve">25.497</w:t>
+                    <w:t xml:space="preserve">24.605</w:t>
                   </w:r>
                 </w:p>
               </w:tc>
@@ -6460,7 +6460,7 @@
                       <w:sz w:val="18"/>
                       <w:szCs w:val="18"/>
                     </w:rPr>
-                    <w:t xml:space="preserve">21.463</w:t>
+                    <w:t xml:space="preserve">20.745</w:t>
                   </w:r>
                 </w:p>
               </w:tc>
@@ -6510,7 +6510,7 @@
                       <w:sz w:val="18"/>
                       <w:szCs w:val="18"/>
                     </w:rPr>
-                    <w:t xml:space="preserve">55.123</w:t>
+                    <w:t xml:space="preserve">53.676</w:t>
                   </w:r>
                 </w:p>
               </w:tc>
@@ -6534,7 +6534,7 @@
                       <w:sz w:val="18"/>
                       <w:szCs w:val="18"/>
                     </w:rPr>
-                    <w:t xml:space="preserve">29.982</w:t>
+                    <w:t xml:space="preserve">27.312</w:t>
                   </w:r>
                 </w:p>
               </w:tc>
@@ -6558,7 +6558,7 @@
                       <w:sz w:val="18"/>
                       <w:szCs w:val="18"/>
                     </w:rPr>
-                    <w:t xml:space="preserve">26.111</w:t>
+                    <w:t xml:space="preserve">23.363</w:t>
                   </w:r>
                 </w:p>
               </w:tc>
@@ -6960,7 +6960,7 @@
                 <w:sz w:val="24"/>
                 <w:szCs w:val="24"/>
               </w:rPr>
-              <w:t xml:space="preserve">（2）错误分析：t18“Lower prices encourage people to buy more.”前三名为 decline-1-1、reluctant-1-2、significant-1-2。查询描述的是“激励”这个概念，而“涨价后销量下降”“顾客不愿为环保产品多付钱”等例句与查询同属价格与购买话题，模型更多捕捉到了话题相似，而不是 incentive 这个词义本身。</w:t>
+              <w:t xml:space="preserve">（2）错误分析：t18“Lower prices encourage people to buy more.”前三名为 decline-1-1、reluctant-1-2、significant-1-1。查询描述的是“激励”这个概念，而“涨价后销量下降”“顾客不愿为环保产品多付钱”等例句与查询同属价格与购买话题，模型更多捕捉到了话题相似，而不是 incentive 这个词义本身。</w:t>
             </w:r>
           </w:p>
           <w:p>
@@ -7008,7 +7008,7 @@
                 <w:sz w:val="24"/>
                 <w:szCs w:val="24"/>
               </w:rPr>
-              <w:t xml:space="preserve">（4）评价的局限：语料与查询都是项目自编的小规模演示内容，查询与相关性标注目前由 AI 起草、尚待人工逐条确认，因此上述指标只反映这份演示语料，确认后需要重新运行评价。</w:t>
+              <w:t xml:space="preserve">（4）评价的局限：语料与查询都是项目自编的小规模演示内容；查询与相关性标注由 AI 起草，并经 AI 逐条复核修正（移出 4 条明显不相关的标注、补充 1 条），不是独立人工标注。复核时已看过前一次评价结果，虽然检索方法与参数未作调整、两种方法使用同一标注，对照仍然公平，但绝对数值可能偏高，只反映这份演示语料。</w:t>
             </w:r>
           </w:p>
           <w:p>
@@ -7055,7 +7055,7 @@
                 <w:sz w:val="24"/>
                 <w:szCs w:val="24"/>
               </w:rPr>
-              <w:t xml:space="preserve">本实验完成了预训练深度学习模型的本地部署与集成：固定模型版本并校验文件、离线构建向量索引、Flask 在线检索、MySQL 留证，并用独立查询集与 TF-IDF 对照评价。句向量检索在 test 集上的 MRR@3 为 0.9074，TF-IDF 为 0.5617。</w:t>
+              <w:t xml:space="preserve">本实验完成了预训练深度学习模型的本地部署与集成：固定模型版本并校验文件、离线构建向量索引、Flask 在线检索、MySQL 留证，并用独立查询集与 TF-IDF 对照评价。句向量检索在 test 集上的 MRR@3 为 0.9259，TF-IDF 为 0.5741。</w:t>
             </w:r>
           </w:p>
           <w:p>
@@ -7079,7 +7079,7 @@
                 <w:sz w:val="24"/>
                 <w:szCs w:val="24"/>
               </w:rPr>
-              <w:t xml:space="preserve">思考：深度学习模型的首次加载开销远大于单次推理（本实验首次请求约 7 秒，预热后约 20 毫秒），应在进程内只加载一次；模型、向量与语料三者的版本必须绑定，任何一方变化都要能被发现并拒绝旧结果。此外，评价数据必须独立于语料、并由人工确认，否则指标很容易高估真实效果。</w:t>
+              <w:t xml:space="preserve">思考：深度学习模型的首次加载开销远大于单次推理（本实验首次请求约 7 秒，预热后约 20 毫秒），应在进程内只加载一次；模型、向量与语料三者的版本必须绑定，任何一方变化都要能被发现并拒绝旧结果。此外，评价数据应独立于语料并由人工确认；本实验的标注只经 AI 复核，这是评价部分最主要的不足。</w:t>
             </w:r>
           </w:p>
           <w:p>

</xml_diff>